<commit_message>
gitAuto manual push @ 2026-06-03 17:33:16
</commit_message>
<xml_diff>
--- a/docs/Report/网络管理与运维实验5 网络工程2301班-雷若奇-23053020134.docx
+++ b/docs/Report/网络管理与运维实验5 网络工程2301班-雷若奇-23053020134.docx
@@ -489,8 +489,6 @@
           </wp:inline>
         </w:drawing>
       </w:r>
-      <w:bookmarkStart w:id="0" w:name="_GoBack"/>
-      <w:bookmarkEnd w:id="0"/>
     </w:p>
     <w:p>
       <w:pPr>
@@ -502,50 +500,431 @@
     </w:p>
     <w:p>
       <w:pPr>
-        <w:rPr>
-          <w:sz w:val="24"/>
-          <w:szCs w:val="24"/>
+        <w:numPr>
+          <w:ilvl w:val="0"/>
+          <w:numId w:val="1"/>
+        </w:numPr>
+        <w:ind w:left="0" w:leftChars="0" w:firstLine="0" w:firstLineChars="0"/>
+        <w:rPr>
+          <w:rFonts w:hint="default" w:eastAsiaTheme="minorEastAsia"/>
+          <w:sz w:val="24"/>
+          <w:szCs w:val="24"/>
+          <w:lang w:val="en-US" w:eastAsia="zh-CN"/>
         </w:rPr>
       </w:pPr>
       <w:r>
         <w:rPr>
-          <w:sz w:val="24"/>
-          <w:szCs w:val="24"/>
-        </w:rPr>
-        <w:t>2</w:t>
-      </w:r>
-      <w:r>
-        <w:rPr>
-          <w:rFonts w:hint="eastAsia"/>
-          <w:sz w:val="24"/>
-          <w:szCs w:val="24"/>
-        </w:rPr>
-        <w:t>.</w:t>
+          <w:rFonts w:hint="eastAsia"/>
+          <w:sz w:val="24"/>
+          <w:szCs w:val="24"/>
+          <w:lang w:val="en-US" w:eastAsia="zh-CN"/>
+        </w:rPr>
+        <w:t>添加凭证</w:t>
+      </w:r>
+      <w:r>
+        <w:rPr>
+          <w:rFonts w:hint="eastAsia"/>
+          <w:sz w:val="24"/>
+          <w:szCs w:val="24"/>
+          <w:lang w:val="en-US" w:eastAsia="zh-CN"/>
+        </w:rPr>
+        <w:br w:type="textWrapping"/>
+      </w:r>
+      <w:r>
+        <w:drawing>
+          <wp:inline distT="0" distB="0" distL="114300" distR="114300">
+            <wp:extent cx="5273040" cy="2526030"/>
+            <wp:effectExtent l="0" t="0" r="3810" b="7620"/>
+            <wp:docPr id="4" name="图片 4"/>
+            <wp:cNvGraphicFramePr>
+              <a:graphicFrameLocks xmlns:a="http://schemas.openxmlformats.org/drawingml/2006/main" noChangeAspect="1"/>
+            </wp:cNvGraphicFramePr>
+            <a:graphic xmlns:a="http://schemas.openxmlformats.org/drawingml/2006/main">
+              <a:graphicData uri="http://schemas.openxmlformats.org/drawingml/2006/picture">
+                <pic:pic xmlns:pic="http://schemas.openxmlformats.org/drawingml/2006/picture">
+                  <pic:nvPicPr>
+                    <pic:cNvPr id="4" name="图片 4"/>
+                    <pic:cNvPicPr>
+                      <a:picLocks noChangeAspect="1"/>
+                    </pic:cNvPicPr>
+                  </pic:nvPicPr>
+                  <pic:blipFill>
+                    <a:blip r:embed="rId7"/>
+                    <a:stretch>
+                      <a:fillRect/>
+                    </a:stretch>
+                  </pic:blipFill>
+                  <pic:spPr>
+                    <a:xfrm>
+                      <a:off x="0" y="0"/>
+                      <a:ext cx="5273040" cy="2526030"/>
+                    </a:xfrm>
+                    <a:prstGeom prst="rect">
+                      <a:avLst/>
+                    </a:prstGeom>
+                    <a:noFill/>
+                    <a:ln>
+                      <a:noFill/>
+                    </a:ln>
+                  </pic:spPr>
+                </pic:pic>
+              </a:graphicData>
+            </a:graphic>
+          </wp:inline>
+        </w:drawing>
+      </w:r>
+      <w:r>
+        <w:br w:type="textWrapping"/>
       </w:r>
     </w:p>
     <w:p>
       <w:pPr>
-        <w:rPr>
-          <w:sz w:val="24"/>
-          <w:szCs w:val="24"/>
+        <w:numPr>
+          <w:ilvl w:val="0"/>
+          <w:numId w:val="1"/>
+        </w:numPr>
+        <w:ind w:left="0" w:leftChars="0" w:firstLine="0" w:firstLineChars="0"/>
+        <w:rPr>
+          <w:rFonts w:hint="eastAsia" w:eastAsiaTheme="minorEastAsia"/>
+          <w:sz w:val="24"/>
+          <w:szCs w:val="24"/>
+          <w:lang w:val="en-US" w:eastAsia="zh-CN"/>
         </w:rPr>
       </w:pPr>
+      <w:r>
+        <w:rPr>
+          <w:rFonts w:hint="eastAsia"/>
+          <w:sz w:val="24"/>
+          <w:szCs w:val="24"/>
+          <w:lang w:val="en-US" w:eastAsia="zh-CN"/>
+        </w:rPr>
+        <w:t>创建清单</w:t>
+      </w:r>
+      <w:r>
+        <w:rPr>
+          <w:rFonts w:hint="eastAsia"/>
+          <w:sz w:val="24"/>
+          <w:szCs w:val="24"/>
+          <w:lang w:val="en-US" w:eastAsia="zh-CN"/>
+        </w:rPr>
+        <w:br w:type="textWrapping"/>
+      </w:r>
+      <w:r>
+        <w:drawing>
+          <wp:inline distT="0" distB="0" distL="114300" distR="114300">
+            <wp:extent cx="5274310" cy="2524125"/>
+            <wp:effectExtent l="0" t="0" r="2540" b="9525"/>
+            <wp:docPr id="5" name="图片 5"/>
+            <wp:cNvGraphicFramePr>
+              <a:graphicFrameLocks xmlns:a="http://schemas.openxmlformats.org/drawingml/2006/main" noChangeAspect="1"/>
+            </wp:cNvGraphicFramePr>
+            <a:graphic xmlns:a="http://schemas.openxmlformats.org/drawingml/2006/main">
+              <a:graphicData uri="http://schemas.openxmlformats.org/drawingml/2006/picture">
+                <pic:pic xmlns:pic="http://schemas.openxmlformats.org/drawingml/2006/picture">
+                  <pic:nvPicPr>
+                    <pic:cNvPr id="5" name="图片 5"/>
+                    <pic:cNvPicPr>
+                      <a:picLocks noChangeAspect="1"/>
+                    </pic:cNvPicPr>
+                  </pic:nvPicPr>
+                  <pic:blipFill>
+                    <a:blip r:embed="rId8"/>
+                    <a:stretch>
+                      <a:fillRect/>
+                    </a:stretch>
+                  </pic:blipFill>
+                  <pic:spPr>
+                    <a:xfrm>
+                      <a:off x="0" y="0"/>
+                      <a:ext cx="5274310" cy="2524125"/>
+                    </a:xfrm>
+                    <a:prstGeom prst="rect">
+                      <a:avLst/>
+                    </a:prstGeom>
+                    <a:noFill/>
+                    <a:ln>
+                      <a:noFill/>
+                    </a:ln>
+                  </pic:spPr>
+                </pic:pic>
+              </a:graphicData>
+            </a:graphic>
+          </wp:inline>
+        </w:drawing>
+      </w:r>
+      <w:r>
+        <w:br w:type="textWrapping"/>
+      </w:r>
     </w:p>
     <w:p>
       <w:pPr>
-        <w:rPr>
-          <w:sz w:val="24"/>
-          <w:szCs w:val="24"/>
+        <w:numPr>
+          <w:ilvl w:val="0"/>
+          <w:numId w:val="1"/>
+        </w:numPr>
+        <w:ind w:left="0" w:leftChars="0" w:firstLine="0" w:firstLineChars="0"/>
+        <w:rPr>
+          <w:rFonts w:hint="eastAsia" w:eastAsiaTheme="minorEastAsia"/>
+          <w:sz w:val="24"/>
+          <w:szCs w:val="24"/>
+          <w:lang w:val="en-US" w:eastAsia="zh-CN"/>
         </w:rPr>
       </w:pPr>
       <w:r>
         <w:rPr>
           <w:rFonts w:hint="eastAsia"/>
-          <w:sz w:val="24"/>
-          <w:szCs w:val="24"/>
-        </w:rPr>
-        <w:t>3.</w:t>
-      </w:r>
+          <w:lang w:val="en-US" w:eastAsia="zh-CN"/>
+        </w:rPr>
+        <w:t>创建项目</w:t>
+      </w:r>
+      <w:r>
+        <w:rPr>
+          <w:rFonts w:hint="eastAsia"/>
+          <w:lang w:val="en-US" w:eastAsia="zh-CN"/>
+        </w:rPr>
+        <w:br w:type="textWrapping"/>
+      </w:r>
+      <w:r>
+        <w:drawing>
+          <wp:inline distT="0" distB="0" distL="114300" distR="114300">
+            <wp:extent cx="5271135" cy="3574415"/>
+            <wp:effectExtent l="0" t="0" r="5715" b="6985"/>
+            <wp:docPr id="7" name="图片 7"/>
+            <wp:cNvGraphicFramePr>
+              <a:graphicFrameLocks xmlns:a="http://schemas.openxmlformats.org/drawingml/2006/main" noChangeAspect="1"/>
+            </wp:cNvGraphicFramePr>
+            <a:graphic xmlns:a="http://schemas.openxmlformats.org/drawingml/2006/main">
+              <a:graphicData uri="http://schemas.openxmlformats.org/drawingml/2006/picture">
+                <pic:pic xmlns:pic="http://schemas.openxmlformats.org/drawingml/2006/picture">
+                  <pic:nvPicPr>
+                    <pic:cNvPr id="7" name="图片 7"/>
+                    <pic:cNvPicPr>
+                      <a:picLocks noChangeAspect="1"/>
+                    </pic:cNvPicPr>
+                  </pic:nvPicPr>
+                  <pic:blipFill>
+                    <a:blip r:embed="rId9"/>
+                    <a:stretch>
+                      <a:fillRect/>
+                    </a:stretch>
+                  </pic:blipFill>
+                  <pic:spPr>
+                    <a:xfrm>
+                      <a:off x="0" y="0"/>
+                      <a:ext cx="5271135" cy="3574415"/>
+                    </a:xfrm>
+                    <a:prstGeom prst="rect">
+                      <a:avLst/>
+                    </a:prstGeom>
+                    <a:noFill/>
+                    <a:ln>
+                      <a:noFill/>
+                    </a:ln>
+                  </pic:spPr>
+                </pic:pic>
+              </a:graphicData>
+            </a:graphic>
+          </wp:inline>
+        </w:drawing>
+      </w:r>
+      <w:r>
+        <w:br w:type="textWrapping"/>
+      </w:r>
+      <w:r>
+        <w:drawing>
+          <wp:inline distT="0" distB="0" distL="114300" distR="114300">
+            <wp:extent cx="5269230" cy="2515235"/>
+            <wp:effectExtent l="0" t="0" r="7620" b="18415"/>
+            <wp:docPr id="8" name="图片 8"/>
+            <wp:cNvGraphicFramePr>
+              <a:graphicFrameLocks xmlns:a="http://schemas.openxmlformats.org/drawingml/2006/main" noChangeAspect="1"/>
+            </wp:cNvGraphicFramePr>
+            <a:graphic xmlns:a="http://schemas.openxmlformats.org/drawingml/2006/main">
+              <a:graphicData uri="http://schemas.openxmlformats.org/drawingml/2006/picture">
+                <pic:pic xmlns:pic="http://schemas.openxmlformats.org/drawingml/2006/picture">
+                  <pic:nvPicPr>
+                    <pic:cNvPr id="8" name="图片 8"/>
+                    <pic:cNvPicPr>
+                      <a:picLocks noChangeAspect="1"/>
+                    </pic:cNvPicPr>
+                  </pic:nvPicPr>
+                  <pic:blipFill>
+                    <a:blip r:embed="rId10"/>
+                    <a:stretch>
+                      <a:fillRect/>
+                    </a:stretch>
+                  </pic:blipFill>
+                  <pic:spPr>
+                    <a:xfrm>
+                      <a:off x="0" y="0"/>
+                      <a:ext cx="5269230" cy="2515235"/>
+                    </a:xfrm>
+                    <a:prstGeom prst="rect">
+                      <a:avLst/>
+                    </a:prstGeom>
+                    <a:noFill/>
+                    <a:ln>
+                      <a:noFill/>
+                    </a:ln>
+                  </pic:spPr>
+                </pic:pic>
+              </a:graphicData>
+            </a:graphic>
+          </wp:inline>
+        </w:drawing>
+      </w:r>
+      <w:r>
+        <w:br w:type="textWrapping"/>
+      </w:r>
+    </w:p>
+    <w:p>
+      <w:pPr>
+        <w:numPr>
+          <w:ilvl w:val="0"/>
+          <w:numId w:val="1"/>
+        </w:numPr>
+        <w:ind w:left="0" w:leftChars="0" w:firstLine="0" w:firstLineChars="0"/>
+        <w:rPr>
+          <w:rFonts w:hint="eastAsia" w:eastAsiaTheme="minorEastAsia"/>
+          <w:sz w:val="24"/>
+          <w:szCs w:val="24"/>
+          <w:lang w:val="en-US" w:eastAsia="zh-CN"/>
+        </w:rPr>
+      </w:pPr>
+      <w:r>
+        <w:rPr>
+          <w:rFonts w:hint="eastAsia"/>
+          <w:lang w:val="en-US" w:eastAsia="zh-CN"/>
+        </w:rPr>
+        <w:t>创建作业模板</w:t>
+      </w:r>
+      <w:r>
+        <w:rPr>
+          <w:rFonts w:hint="eastAsia"/>
+          <w:lang w:val="en-US" w:eastAsia="zh-CN"/>
+        </w:rPr>
+        <w:br w:type="textWrapping"/>
+      </w:r>
+      <w:r>
+        <w:drawing>
+          <wp:inline distT="0" distB="0" distL="114300" distR="114300">
+            <wp:extent cx="5259705" cy="2508885"/>
+            <wp:effectExtent l="0" t="0" r="17145" b="5715"/>
+            <wp:docPr id="9" name="图片 9"/>
+            <wp:cNvGraphicFramePr>
+              <a:graphicFrameLocks xmlns:a="http://schemas.openxmlformats.org/drawingml/2006/main" noChangeAspect="1"/>
+            </wp:cNvGraphicFramePr>
+            <a:graphic xmlns:a="http://schemas.openxmlformats.org/drawingml/2006/main">
+              <a:graphicData uri="http://schemas.openxmlformats.org/drawingml/2006/picture">
+                <pic:pic xmlns:pic="http://schemas.openxmlformats.org/drawingml/2006/picture">
+                  <pic:nvPicPr>
+                    <pic:cNvPr id="9" name="图片 9"/>
+                    <pic:cNvPicPr>
+                      <a:picLocks noChangeAspect="1"/>
+                    </pic:cNvPicPr>
+                  </pic:nvPicPr>
+                  <pic:blipFill>
+                    <a:blip r:embed="rId11"/>
+                    <a:stretch>
+                      <a:fillRect/>
+                    </a:stretch>
+                  </pic:blipFill>
+                  <pic:spPr>
+                    <a:xfrm>
+                      <a:off x="0" y="0"/>
+                      <a:ext cx="5259705" cy="2508885"/>
+                    </a:xfrm>
+                    <a:prstGeom prst="rect">
+                      <a:avLst/>
+                    </a:prstGeom>
+                    <a:noFill/>
+                    <a:ln>
+                      <a:noFill/>
+                    </a:ln>
+                  </pic:spPr>
+                </pic:pic>
+              </a:graphicData>
+            </a:graphic>
+          </wp:inline>
+        </w:drawing>
+      </w:r>
+      <w:r>
+        <w:br w:type="textWrapping"/>
+      </w:r>
+    </w:p>
+    <w:p>
+      <w:pPr>
+        <w:numPr>
+          <w:ilvl w:val="0"/>
+          <w:numId w:val="1"/>
+        </w:numPr>
+        <w:ind w:left="0" w:leftChars="0" w:firstLine="0" w:firstLineChars="0"/>
+        <w:rPr>
+          <w:rFonts w:hint="eastAsia" w:eastAsiaTheme="minorEastAsia"/>
+          <w:sz w:val="24"/>
+          <w:szCs w:val="24"/>
+          <w:lang w:val="en-US" w:eastAsia="zh-CN"/>
+        </w:rPr>
+      </w:pPr>
+      <w:r>
+        <w:rPr>
+          <w:rFonts w:hint="eastAsia"/>
+          <w:lang w:val="en-US" w:eastAsia="zh-CN"/>
+        </w:rPr>
+        <w:t>运行</w:t>
+      </w:r>
+      <w:r>
+        <w:rPr>
+          <w:rFonts w:hint="eastAsia"/>
+          <w:lang w:val="en-US" w:eastAsia="zh-CN"/>
+        </w:rPr>
+        <w:br w:type="textWrapping"/>
+      </w:r>
+      <w:r>
+        <w:drawing>
+          <wp:inline distT="0" distB="0" distL="114300" distR="114300">
+            <wp:extent cx="5266055" cy="2956560"/>
+            <wp:effectExtent l="0" t="0" r="10795" b="15240"/>
+            <wp:docPr id="10" name="图片 10"/>
+            <wp:cNvGraphicFramePr>
+              <a:graphicFrameLocks xmlns:a="http://schemas.openxmlformats.org/drawingml/2006/main" noChangeAspect="1"/>
+            </wp:cNvGraphicFramePr>
+            <a:graphic xmlns:a="http://schemas.openxmlformats.org/drawingml/2006/main">
+              <a:graphicData uri="http://schemas.openxmlformats.org/drawingml/2006/picture">
+                <pic:pic xmlns:pic="http://schemas.openxmlformats.org/drawingml/2006/picture">
+                  <pic:nvPicPr>
+                    <pic:cNvPr id="10" name="图片 10"/>
+                    <pic:cNvPicPr>
+                      <a:picLocks noChangeAspect="1"/>
+                    </pic:cNvPicPr>
+                  </pic:nvPicPr>
+                  <pic:blipFill>
+                    <a:blip r:embed="rId12"/>
+                    <a:stretch>
+                      <a:fillRect/>
+                    </a:stretch>
+                  </pic:blipFill>
+                  <pic:spPr>
+                    <a:xfrm>
+                      <a:off x="0" y="0"/>
+                      <a:ext cx="5266055" cy="2956560"/>
+                    </a:xfrm>
+                    <a:prstGeom prst="rect">
+                      <a:avLst/>
+                    </a:prstGeom>
+                    <a:noFill/>
+                    <a:ln>
+                      <a:noFill/>
+                    </a:ln>
+                  </pic:spPr>
+                </pic:pic>
+              </a:graphicData>
+            </a:graphic>
+          </wp:inline>
+        </w:drawing>
+      </w:r>
+      <w:bookmarkStart w:id="0" w:name="_GoBack"/>
+      <w:bookmarkEnd w:id="0"/>
     </w:p>
     <w:p>
       <w:pPr>

</xml_diff>

<commit_message>
gitAuto manual push @ 2026-06-03 17:37:53
</commit_message>
<xml_diff>
--- a/docs/Report/网络管理与运维实验5 网络工程2301班-雷若奇-23053020134.docx
+++ b/docs/Report/网络管理与运维实验5 网络工程2301班-雷若奇-23053020134.docx
@@ -357,11 +357,12 @@
         </w:rPr>
         <w:br w:type="textWrapping"/>
       </w:r>
+      <w:bookmarkStart w:id="0" w:name="_GoBack"/>
       <w:r>
         <w:drawing>
           <wp:inline distT="0" distB="0" distL="114300" distR="114300">
-            <wp:extent cx="5273040" cy="4324350"/>
-            <wp:effectExtent l="0" t="0" r="3810" b="0"/>
+            <wp:extent cx="5272405" cy="4323715"/>
+            <wp:effectExtent l="0" t="0" r="4445" b="635"/>
             <wp:docPr id="2" name="图片 2"/>
             <wp:cNvGraphicFramePr>
               <a:graphicFrameLocks xmlns:a="http://schemas.openxmlformats.org/drawingml/2006/main" noChangeAspect="1"/>
@@ -384,7 +385,7 @@
                   <pic:spPr>
                     <a:xfrm>
                       <a:off x="0" y="0"/>
-                      <a:ext cx="5273040" cy="4324350"/>
+                      <a:ext cx="5272405" cy="4323715"/>
                     </a:xfrm>
                     <a:prstGeom prst="rect">
                       <a:avLst/>
@@ -400,11 +401,12 @@
           </wp:inline>
         </w:drawing>
       </w:r>
+      <w:bookmarkEnd w:id="0"/>
       <w:r>
         <w:drawing>
           <wp:inline distT="0" distB="0" distL="114300" distR="114300">
-            <wp:extent cx="5268595" cy="4321810"/>
-            <wp:effectExtent l="0" t="0" r="8255" b="2540"/>
+            <wp:extent cx="5267960" cy="4321175"/>
+            <wp:effectExtent l="0" t="0" r="8890" b="3175"/>
             <wp:docPr id="1" name="图片 1"/>
             <wp:cNvGraphicFramePr>
               <a:graphicFrameLocks xmlns:a="http://schemas.openxmlformats.org/drawingml/2006/main" noChangeAspect="1"/>
@@ -427,7 +429,7 @@
                   <pic:spPr>
                     <a:xfrm>
                       <a:off x="0" y="0"/>
-                      <a:ext cx="5268595" cy="4321810"/>
+                      <a:ext cx="5267960" cy="4321175"/>
                     </a:xfrm>
                     <a:prstGeom prst="rect">
                       <a:avLst/>
@@ -449,8 +451,8 @@
       <w:r>
         <w:drawing>
           <wp:inline distT="0" distB="0" distL="114300" distR="114300">
-            <wp:extent cx="5268595" cy="4279900"/>
-            <wp:effectExtent l="0" t="0" r="8255" b="6350"/>
+            <wp:extent cx="5267960" cy="4279265"/>
+            <wp:effectExtent l="0" t="0" r="8890" b="6985"/>
             <wp:docPr id="3" name="图片 3"/>
             <wp:cNvGraphicFramePr>
               <a:graphicFrameLocks xmlns:a="http://schemas.openxmlformats.org/drawingml/2006/main" noChangeAspect="1"/>
@@ -473,7 +475,7 @@
                   <pic:spPr>
                     <a:xfrm>
                       <a:off x="0" y="0"/>
-                      <a:ext cx="5268595" cy="4279900"/>
+                      <a:ext cx="5267960" cy="4279265"/>
                     </a:xfrm>
                     <a:prstGeom prst="rect">
                       <a:avLst/>
@@ -533,8 +535,8 @@
       <w:r>
         <w:drawing>
           <wp:inline distT="0" distB="0" distL="114300" distR="114300">
-            <wp:extent cx="5273040" cy="2526030"/>
-            <wp:effectExtent l="0" t="0" r="3810" b="7620"/>
+            <wp:extent cx="5271770" cy="2525395"/>
+            <wp:effectExtent l="0" t="0" r="5080" b="8255"/>
             <wp:docPr id="4" name="图片 4"/>
             <wp:cNvGraphicFramePr>
               <a:graphicFrameLocks xmlns:a="http://schemas.openxmlformats.org/drawingml/2006/main" noChangeAspect="1"/>
@@ -557,7 +559,7 @@
                   <pic:spPr>
                     <a:xfrm>
                       <a:off x="0" y="0"/>
-                      <a:ext cx="5273040" cy="2526030"/>
+                      <a:ext cx="5271770" cy="2525395"/>
                     </a:xfrm>
                     <a:prstGeom prst="rect">
                       <a:avLst/>
@@ -612,8 +614,8 @@
       <w:r>
         <w:drawing>
           <wp:inline distT="0" distB="0" distL="114300" distR="114300">
-            <wp:extent cx="5274310" cy="2524125"/>
-            <wp:effectExtent l="0" t="0" r="2540" b="9525"/>
+            <wp:extent cx="5273040" cy="2523490"/>
+            <wp:effectExtent l="0" t="0" r="3810" b="10160"/>
             <wp:docPr id="5" name="图片 5"/>
             <wp:cNvGraphicFramePr>
               <a:graphicFrameLocks xmlns:a="http://schemas.openxmlformats.org/drawingml/2006/main" noChangeAspect="1"/>
@@ -636,7 +638,7 @@
                   <pic:spPr>
                     <a:xfrm>
                       <a:off x="0" y="0"/>
-                      <a:ext cx="5274310" cy="2524125"/>
+                      <a:ext cx="5273040" cy="2523490"/>
                     </a:xfrm>
                     <a:prstGeom prst="rect">
                       <a:avLst/>
@@ -687,8 +689,8 @@
       <w:r>
         <w:drawing>
           <wp:inline distT="0" distB="0" distL="114300" distR="114300">
-            <wp:extent cx="5271135" cy="3574415"/>
-            <wp:effectExtent l="0" t="0" r="5715" b="6985"/>
+            <wp:extent cx="5270500" cy="3573780"/>
+            <wp:effectExtent l="0" t="0" r="6350" b="7620"/>
             <wp:docPr id="7" name="图片 7"/>
             <wp:cNvGraphicFramePr>
               <a:graphicFrameLocks xmlns:a="http://schemas.openxmlformats.org/drawingml/2006/main" noChangeAspect="1"/>
@@ -711,7 +713,7 @@
                   <pic:spPr>
                     <a:xfrm>
                       <a:off x="0" y="0"/>
-                      <a:ext cx="5271135" cy="3574415"/>
+                      <a:ext cx="5270500" cy="3573780"/>
                     </a:xfrm>
                     <a:prstGeom prst="rect">
                       <a:avLst/>
@@ -733,8 +735,8 @@
       <w:r>
         <w:drawing>
           <wp:inline distT="0" distB="0" distL="114300" distR="114300">
-            <wp:extent cx="5269230" cy="2515235"/>
-            <wp:effectExtent l="0" t="0" r="7620" b="18415"/>
+            <wp:extent cx="5267960" cy="2514600"/>
+            <wp:effectExtent l="0" t="0" r="8890" b="0"/>
             <wp:docPr id="8" name="图片 8"/>
             <wp:cNvGraphicFramePr>
               <a:graphicFrameLocks xmlns:a="http://schemas.openxmlformats.org/drawingml/2006/main" noChangeAspect="1"/>
@@ -757,7 +759,7 @@
                   <pic:spPr>
                     <a:xfrm>
                       <a:off x="0" y="0"/>
-                      <a:ext cx="5269230" cy="2515235"/>
+                      <a:ext cx="5267960" cy="2514600"/>
                     </a:xfrm>
                     <a:prstGeom prst="rect">
                       <a:avLst/>
@@ -808,8 +810,8 @@
       <w:r>
         <w:drawing>
           <wp:inline distT="0" distB="0" distL="114300" distR="114300">
-            <wp:extent cx="5259705" cy="2508885"/>
-            <wp:effectExtent l="0" t="0" r="17145" b="5715"/>
+            <wp:extent cx="5258435" cy="2508250"/>
+            <wp:effectExtent l="0" t="0" r="18415" b="6350"/>
             <wp:docPr id="9" name="图片 9"/>
             <wp:cNvGraphicFramePr>
               <a:graphicFrameLocks xmlns:a="http://schemas.openxmlformats.org/drawingml/2006/main" noChangeAspect="1"/>
@@ -832,7 +834,7 @@
                   <pic:spPr>
                     <a:xfrm>
                       <a:off x="0" y="0"/>
-                      <a:ext cx="5259705" cy="2508885"/>
+                      <a:ext cx="5258435" cy="2508250"/>
                     </a:xfrm>
                     <a:prstGeom prst="rect">
                       <a:avLst/>
@@ -883,8 +885,8 @@
       <w:r>
         <w:drawing>
           <wp:inline distT="0" distB="0" distL="114300" distR="114300">
-            <wp:extent cx="5266055" cy="2956560"/>
-            <wp:effectExtent l="0" t="0" r="10795" b="15240"/>
+            <wp:extent cx="5265420" cy="2955925"/>
+            <wp:effectExtent l="0" t="0" r="11430" b="15875"/>
             <wp:docPr id="10" name="图片 10"/>
             <wp:cNvGraphicFramePr>
               <a:graphicFrameLocks xmlns:a="http://schemas.openxmlformats.org/drawingml/2006/main" noChangeAspect="1"/>
@@ -907,7 +909,7 @@
                   <pic:spPr>
                     <a:xfrm>
                       <a:off x="0" y="0"/>
-                      <a:ext cx="5266055" cy="2956560"/>
+                      <a:ext cx="5265420" cy="2955925"/>
                     </a:xfrm>
                     <a:prstGeom prst="rect">
                       <a:avLst/>
@@ -923,8 +925,6 @@
           </wp:inline>
         </w:drawing>
       </w:r>
-      <w:bookmarkStart w:id="0" w:name="_GoBack"/>
-      <w:bookmarkEnd w:id="0"/>
     </w:p>
     <w:p>
       <w:pPr>

</xml_diff>